<commit_message>
Refresh iMedX appendix with reliable live page captures
</commit_message>
<xml_diff>
--- a/tmp-transfer/iMedX_All_Live_Website_Screenshots_Appendix.docx
+++ b/tmp-transfer/iMedX_All_Live_Website_Screenshots_Appendix.docx
@@ -148,7 +148,7 @@
             <w:r>
               <w:drawing>
                 <wp:inline xmlns:a="http://schemas.openxmlformats.org/drawingml/2006/main" xmlns:pic="http://schemas.openxmlformats.org/drawingml/2006/picture">
-                  <wp:extent cx="4434840" cy="2882646"/>
+                  <wp:extent cx="4434840" cy="2771775"/>
                   <wp:docPr id="1" name="Picture 1"/>
                   <wp:cNvGraphicFramePr>
                     <a:graphicFrameLocks noChangeAspect="1"/>
@@ -169,7 +169,7 @@
                         <pic:spPr>
                           <a:xfrm>
                             <a:off x="0" y="0"/>
-                            <a:ext cx="4434840" cy="2882646"/>
+                            <a:ext cx="4434840" cy="2771775"/>
                           </a:xfrm>
                           <a:prstGeom prst="rect"/>
                         </pic:spPr>
@@ -238,7 +238,7 @@
             <w:r>
               <w:drawing>
                 <wp:inline xmlns:a="http://schemas.openxmlformats.org/drawingml/2006/main" xmlns:pic="http://schemas.openxmlformats.org/drawingml/2006/picture">
-                  <wp:extent cx="4434840" cy="2882646"/>
+                  <wp:extent cx="4434840" cy="2771775"/>
                   <wp:docPr id="2" name="Picture 2"/>
                   <wp:cNvGraphicFramePr>
                     <a:graphicFrameLocks noChangeAspect="1"/>
@@ -259,7 +259,7 @@
                         <pic:spPr>
                           <a:xfrm>
                             <a:off x="0" y="0"/>
-                            <a:ext cx="4434840" cy="2882646"/>
+                            <a:ext cx="4434840" cy="2771775"/>
                           </a:xfrm>
                           <a:prstGeom prst="rect"/>
                         </pic:spPr>
@@ -371,7 +371,7 @@
             <w:r>
               <w:drawing>
                 <wp:inline xmlns:a="http://schemas.openxmlformats.org/drawingml/2006/main" xmlns:pic="http://schemas.openxmlformats.org/drawingml/2006/picture">
-                  <wp:extent cx="4434840" cy="2882646"/>
+                  <wp:extent cx="4434840" cy="2771775"/>
                   <wp:docPr id="3" name="Picture 3"/>
                   <wp:cNvGraphicFramePr>
                     <a:graphicFrameLocks noChangeAspect="1"/>
@@ -392,7 +392,7 @@
                         <pic:spPr>
                           <a:xfrm>
                             <a:off x="0" y="0"/>
-                            <a:ext cx="4434840" cy="2882646"/>
+                            <a:ext cx="4434840" cy="2771775"/>
                           </a:xfrm>
                           <a:prstGeom prst="rect"/>
                         </pic:spPr>
@@ -461,7 +461,7 @@
             <w:r>
               <w:drawing>
                 <wp:inline xmlns:a="http://schemas.openxmlformats.org/drawingml/2006/main" xmlns:pic="http://schemas.openxmlformats.org/drawingml/2006/picture">
-                  <wp:extent cx="4434840" cy="2882646"/>
+                  <wp:extent cx="4434840" cy="2771775"/>
                   <wp:docPr id="4" name="Picture 4"/>
                   <wp:cNvGraphicFramePr>
                     <a:graphicFrameLocks noChangeAspect="1"/>
@@ -482,7 +482,7 @@
                         <pic:spPr>
                           <a:xfrm>
                             <a:off x="0" y="0"/>
-                            <a:ext cx="4434840" cy="2882646"/>
+                            <a:ext cx="4434840" cy="2771775"/>
                           </a:xfrm>
                           <a:prstGeom prst="rect"/>
                         </pic:spPr>
@@ -594,7 +594,7 @@
             <w:r>
               <w:drawing>
                 <wp:inline xmlns:a="http://schemas.openxmlformats.org/drawingml/2006/main" xmlns:pic="http://schemas.openxmlformats.org/drawingml/2006/picture">
-                  <wp:extent cx="4434840" cy="2882646"/>
+                  <wp:extent cx="4434840" cy="2771775"/>
                   <wp:docPr id="5" name="Picture 5"/>
                   <wp:cNvGraphicFramePr>
                     <a:graphicFrameLocks noChangeAspect="1"/>
@@ -615,7 +615,7 @@
                         <pic:spPr>
                           <a:xfrm>
                             <a:off x="0" y="0"/>
-                            <a:ext cx="4434840" cy="2882646"/>
+                            <a:ext cx="4434840" cy="2771775"/>
                           </a:xfrm>
                           <a:prstGeom prst="rect"/>
                         </pic:spPr>
@@ -684,7 +684,7 @@
             <w:r>
               <w:drawing>
                 <wp:inline xmlns:a="http://schemas.openxmlformats.org/drawingml/2006/main" xmlns:pic="http://schemas.openxmlformats.org/drawingml/2006/picture">
-                  <wp:extent cx="4434840" cy="2882646"/>
+                  <wp:extent cx="4434840" cy="2771775"/>
                   <wp:docPr id="6" name="Picture 6"/>
                   <wp:cNvGraphicFramePr>
                     <a:graphicFrameLocks noChangeAspect="1"/>
@@ -705,7 +705,7 @@
                         <pic:spPr>
                           <a:xfrm>
                             <a:off x="0" y="0"/>
-                            <a:ext cx="4434840" cy="2882646"/>
+                            <a:ext cx="4434840" cy="2771775"/>
                           </a:xfrm>
                           <a:prstGeom prst="rect"/>
                         </pic:spPr>
@@ -817,7 +817,7 @@
             <w:r>
               <w:drawing>
                 <wp:inline xmlns:a="http://schemas.openxmlformats.org/drawingml/2006/main" xmlns:pic="http://schemas.openxmlformats.org/drawingml/2006/picture">
-                  <wp:extent cx="4434840" cy="2882646"/>
+                  <wp:extent cx="4434840" cy="2771775"/>
                   <wp:docPr id="7" name="Picture 7"/>
                   <wp:cNvGraphicFramePr>
                     <a:graphicFrameLocks noChangeAspect="1"/>
@@ -838,7 +838,7 @@
                         <pic:spPr>
                           <a:xfrm>
                             <a:off x="0" y="0"/>
-                            <a:ext cx="4434840" cy="2882646"/>
+                            <a:ext cx="4434840" cy="2771775"/>
                           </a:xfrm>
                           <a:prstGeom prst="rect"/>
                         </pic:spPr>
@@ -907,7 +907,7 @@
             <w:r>
               <w:drawing>
                 <wp:inline xmlns:a="http://schemas.openxmlformats.org/drawingml/2006/main" xmlns:pic="http://schemas.openxmlformats.org/drawingml/2006/picture">
-                  <wp:extent cx="4434840" cy="2882646"/>
+                  <wp:extent cx="4434840" cy="2771775"/>
                   <wp:docPr id="8" name="Picture 8"/>
                   <wp:cNvGraphicFramePr>
                     <a:graphicFrameLocks noChangeAspect="1"/>
@@ -928,7 +928,7 @@
                         <pic:spPr>
                           <a:xfrm>
                             <a:off x="0" y="0"/>
-                            <a:ext cx="4434840" cy="2882646"/>
+                            <a:ext cx="4434840" cy="2771775"/>
                           </a:xfrm>
                           <a:prstGeom prst="rect"/>
                         </pic:spPr>
@@ -1040,7 +1040,7 @@
             <w:r>
               <w:drawing>
                 <wp:inline xmlns:a="http://schemas.openxmlformats.org/drawingml/2006/main" xmlns:pic="http://schemas.openxmlformats.org/drawingml/2006/picture">
-                  <wp:extent cx="4434840" cy="2882646"/>
+                  <wp:extent cx="4434840" cy="2771775"/>
                   <wp:docPr id="9" name="Picture 9"/>
                   <wp:cNvGraphicFramePr>
                     <a:graphicFrameLocks noChangeAspect="1"/>
@@ -1061,7 +1061,7 @@
                         <pic:spPr>
                           <a:xfrm>
                             <a:off x="0" y="0"/>
-                            <a:ext cx="4434840" cy="2882646"/>
+                            <a:ext cx="4434840" cy="2771775"/>
                           </a:xfrm>
                           <a:prstGeom prst="rect"/>
                         </pic:spPr>
@@ -1130,7 +1130,7 @@
             <w:r>
               <w:drawing>
                 <wp:inline xmlns:a="http://schemas.openxmlformats.org/drawingml/2006/main" xmlns:pic="http://schemas.openxmlformats.org/drawingml/2006/picture">
-                  <wp:extent cx="4434840" cy="2882646"/>
+                  <wp:extent cx="4434840" cy="2771775"/>
                   <wp:docPr id="10" name="Picture 10"/>
                   <wp:cNvGraphicFramePr>
                     <a:graphicFrameLocks noChangeAspect="1"/>
@@ -1151,7 +1151,7 @@
                         <pic:spPr>
                           <a:xfrm>
                             <a:off x="0" y="0"/>
-                            <a:ext cx="4434840" cy="2882646"/>
+                            <a:ext cx="4434840" cy="2771775"/>
                           </a:xfrm>
                           <a:prstGeom prst="rect"/>
                         </pic:spPr>
@@ -1263,7 +1263,7 @@
             <w:r>
               <w:drawing>
                 <wp:inline xmlns:a="http://schemas.openxmlformats.org/drawingml/2006/main" xmlns:pic="http://schemas.openxmlformats.org/drawingml/2006/picture">
-                  <wp:extent cx="4434840" cy="2882646"/>
+                  <wp:extent cx="4434840" cy="2771775"/>
                   <wp:docPr id="11" name="Picture 11"/>
                   <wp:cNvGraphicFramePr>
                     <a:graphicFrameLocks noChangeAspect="1"/>
@@ -1284,7 +1284,7 @@
                         <pic:spPr>
                           <a:xfrm>
                             <a:off x="0" y="0"/>
-                            <a:ext cx="4434840" cy="2882646"/>
+                            <a:ext cx="4434840" cy="2771775"/>
                           </a:xfrm>
                           <a:prstGeom prst="rect"/>
                         </pic:spPr>
@@ -1353,7 +1353,7 @@
             <w:r>
               <w:drawing>
                 <wp:inline xmlns:a="http://schemas.openxmlformats.org/drawingml/2006/main" xmlns:pic="http://schemas.openxmlformats.org/drawingml/2006/picture">
-                  <wp:extent cx="4434840" cy="2882646"/>
+                  <wp:extent cx="4434840" cy="2771775"/>
                   <wp:docPr id="12" name="Picture 12"/>
                   <wp:cNvGraphicFramePr>
                     <a:graphicFrameLocks noChangeAspect="1"/>
@@ -1362,11 +1362,11 @@
                     <a:graphicData uri="http://schemas.openxmlformats.org/drawingml/2006/picture">
                       <pic:pic>
                         <pic:nvPicPr>
-                          <pic:cNvPr id="0" name="prototype-rcm.jpg"/>
+                          <pic:cNvPr id="0" name="prototype-outsourced-coding.jpg"/>
                           <pic:cNvPicPr/>
                         </pic:nvPicPr>
                         <pic:blipFill>
-                          <a:blip r:embed="rId14"/>
+                          <a:blip r:embed="rId20"/>
                           <a:stretch>
                             <a:fillRect/>
                           </a:stretch>
@@ -1374,7 +1374,7 @@
                         <pic:spPr>
                           <a:xfrm>
                             <a:off x="0" y="0"/>
-                            <a:ext cx="4434840" cy="2882646"/>
+                            <a:ext cx="4434840" cy="2771775"/>
                           </a:xfrm>
                           <a:prstGeom prst="rect"/>
                         </pic:spPr>
@@ -1486,7 +1486,7 @@
             <w:r>
               <w:drawing>
                 <wp:inline xmlns:a="http://schemas.openxmlformats.org/drawingml/2006/main" xmlns:pic="http://schemas.openxmlformats.org/drawingml/2006/picture">
-                  <wp:extent cx="4434840" cy="2882646"/>
+                  <wp:extent cx="4434840" cy="2771775"/>
                   <wp:docPr id="13" name="Picture 13"/>
                   <wp:cNvGraphicFramePr>
                     <a:graphicFrameLocks noChangeAspect="1"/>
@@ -1499,7 +1499,7 @@
                           <pic:cNvPicPr/>
                         </pic:nvPicPr>
                         <pic:blipFill>
-                          <a:blip r:embed="rId20"/>
+                          <a:blip r:embed="rId21"/>
                           <a:stretch>
                             <a:fillRect/>
                           </a:stretch>
@@ -1507,7 +1507,7 @@
                         <pic:spPr>
                           <a:xfrm>
                             <a:off x="0" y="0"/>
-                            <a:ext cx="4434840" cy="2882646"/>
+                            <a:ext cx="4434840" cy="2771775"/>
                           </a:xfrm>
                           <a:prstGeom prst="rect"/>
                         </pic:spPr>
@@ -1576,7 +1576,7 @@
             <w:r>
               <w:drawing>
                 <wp:inline xmlns:a="http://schemas.openxmlformats.org/drawingml/2006/main" xmlns:pic="http://schemas.openxmlformats.org/drawingml/2006/picture">
-                  <wp:extent cx="4434840" cy="2882646"/>
+                  <wp:extent cx="4434840" cy="2771775"/>
                   <wp:docPr id="14" name="Picture 14"/>
                   <wp:cNvGraphicFramePr>
                     <a:graphicFrameLocks noChangeAspect="1"/>
@@ -1589,7 +1589,7 @@
                           <pic:cNvPicPr/>
                         </pic:nvPicPr>
                         <pic:blipFill>
-                          <a:blip r:embed="rId21"/>
+                          <a:blip r:embed="rId22"/>
                           <a:stretch>
                             <a:fillRect/>
                           </a:stretch>
@@ -1597,7 +1597,7 @@
                         <pic:spPr>
                           <a:xfrm>
                             <a:off x="0" y="0"/>
-                            <a:ext cx="4434840" cy="2882646"/>
+                            <a:ext cx="4434840" cy="2771775"/>
                           </a:xfrm>
                           <a:prstGeom prst="rect"/>
                         </pic:spPr>
@@ -1709,7 +1709,7 @@
             <w:r>
               <w:drawing>
                 <wp:inline xmlns:a="http://schemas.openxmlformats.org/drawingml/2006/main" xmlns:pic="http://schemas.openxmlformats.org/drawingml/2006/picture">
-                  <wp:extent cx="4434840" cy="2882646"/>
+                  <wp:extent cx="4434840" cy="2771775"/>
                   <wp:docPr id="15" name="Picture 15"/>
                   <wp:cNvGraphicFramePr>
                     <a:graphicFrameLocks noChangeAspect="1"/>
@@ -1722,7 +1722,7 @@
                           <pic:cNvPicPr/>
                         </pic:nvPicPr>
                         <pic:blipFill>
-                          <a:blip r:embed="rId22"/>
+                          <a:blip r:embed="rId23"/>
                           <a:stretch>
                             <a:fillRect/>
                           </a:stretch>
@@ -1730,7 +1730,7 @@
                         <pic:spPr>
                           <a:xfrm>
                             <a:off x="0" y="0"/>
-                            <a:ext cx="4434840" cy="2882646"/>
+                            <a:ext cx="4434840" cy="2771775"/>
                           </a:xfrm>
                           <a:prstGeom prst="rect"/>
                         </pic:spPr>
@@ -1799,7 +1799,7 @@
             <w:r>
               <w:drawing>
                 <wp:inline xmlns:a="http://schemas.openxmlformats.org/drawingml/2006/main" xmlns:pic="http://schemas.openxmlformats.org/drawingml/2006/picture">
-                  <wp:extent cx="4434840" cy="2882646"/>
+                  <wp:extent cx="4434840" cy="2771775"/>
                   <wp:docPr id="16" name="Picture 16"/>
                   <wp:cNvGraphicFramePr>
                     <a:graphicFrameLocks noChangeAspect="1"/>
@@ -1808,11 +1808,11 @@
                     <a:graphicData uri="http://schemas.openxmlformats.org/drawingml/2006/picture">
                       <pic:pic>
                         <pic:nvPicPr>
-                          <pic:cNvPr id="0" name="prototype-rcm.jpg"/>
+                          <pic:cNvPr id="0" name="prototype-resource-hub.jpg"/>
                           <pic:cNvPicPr/>
                         </pic:nvPicPr>
                         <pic:blipFill>
-                          <a:blip r:embed="rId14"/>
+                          <a:blip r:embed="rId24"/>
                           <a:stretch>
                             <a:fillRect/>
                           </a:stretch>
@@ -1820,7 +1820,7 @@
                         <pic:spPr>
                           <a:xfrm>
                             <a:off x="0" y="0"/>
-                            <a:ext cx="4434840" cy="2882646"/>
+                            <a:ext cx="4434840" cy="2771775"/>
                           </a:xfrm>
                           <a:prstGeom prst="rect"/>
                         </pic:spPr>
@@ -1932,7 +1932,7 @@
             <w:r>
               <w:drawing>
                 <wp:inline xmlns:a="http://schemas.openxmlformats.org/drawingml/2006/main" xmlns:pic="http://schemas.openxmlformats.org/drawingml/2006/picture">
-                  <wp:extent cx="4434840" cy="2882646"/>
+                  <wp:extent cx="4434840" cy="2771775"/>
                   <wp:docPr id="17" name="Picture 17"/>
                   <wp:cNvGraphicFramePr>
                     <a:graphicFrameLocks noChangeAspect="1"/>
@@ -1945,7 +1945,7 @@
                           <pic:cNvPicPr/>
                         </pic:nvPicPr>
                         <pic:blipFill>
-                          <a:blip r:embed="rId23"/>
+                          <a:blip r:embed="rId25"/>
                           <a:stretch>
                             <a:fillRect/>
                           </a:stretch>
@@ -1953,7 +1953,7 @@
                         <pic:spPr>
                           <a:xfrm>
                             <a:off x="0" y="0"/>
-                            <a:ext cx="4434840" cy="2882646"/>
+                            <a:ext cx="4434840" cy="2771775"/>
                           </a:xfrm>
                           <a:prstGeom prst="rect"/>
                         </pic:spPr>
@@ -2022,7 +2022,7 @@
             <w:r>
               <w:drawing>
                 <wp:inline xmlns:a="http://schemas.openxmlformats.org/drawingml/2006/main" xmlns:pic="http://schemas.openxmlformats.org/drawingml/2006/picture">
-                  <wp:extent cx="4434840" cy="2882646"/>
+                  <wp:extent cx="4434840" cy="2771775"/>
                   <wp:docPr id="18" name="Picture 18"/>
                   <wp:cNvGraphicFramePr>
                     <a:graphicFrameLocks noChangeAspect="1"/>
@@ -2035,7 +2035,7 @@
                           <pic:cNvPicPr/>
                         </pic:nvPicPr>
                         <pic:blipFill>
-                          <a:blip r:embed="rId24"/>
+                          <a:blip r:embed="rId26"/>
                           <a:stretch>
                             <a:fillRect/>
                           </a:stretch>
@@ -2043,7 +2043,7 @@
                         <pic:spPr>
                           <a:xfrm>
                             <a:off x="0" y="0"/>
-                            <a:ext cx="4434840" cy="2882646"/>
+                            <a:ext cx="4434840" cy="2771775"/>
                           </a:xfrm>
                           <a:prstGeom prst="rect"/>
                         </pic:spPr>
@@ -2153,7 +2153,7 @@
             <w:r>
               <w:drawing>
                 <wp:inline xmlns:a="http://schemas.openxmlformats.org/drawingml/2006/main" xmlns:pic="http://schemas.openxmlformats.org/drawingml/2006/picture">
-                  <wp:extent cx="9144000" cy="5943600"/>
+                  <wp:extent cx="9144000" cy="5715000"/>
                   <wp:docPr id="19" name="Picture 19"/>
                   <wp:cNvGraphicFramePr>
                     <a:graphicFrameLocks noChangeAspect="1"/>
@@ -2166,7 +2166,7 @@
                           <pic:cNvPicPr/>
                         </pic:nvPicPr>
                         <pic:blipFill>
-                          <a:blip r:embed="rId25"/>
+                          <a:blip r:embed="rId27"/>
                           <a:stretch>
                             <a:fillRect/>
                           </a:stretch>
@@ -2174,7 +2174,7 @@
                         <pic:spPr>
                           <a:xfrm>
                             <a:off x="0" y="0"/>
-                            <a:ext cx="9144000" cy="5943600"/>
+                            <a:ext cx="9144000" cy="5715000"/>
                           </a:xfrm>
                           <a:prstGeom prst="rect"/>
                         </pic:spPr>
@@ -2284,7 +2284,7 @@
             <w:r>
               <w:drawing>
                 <wp:inline xmlns:a="http://schemas.openxmlformats.org/drawingml/2006/main" xmlns:pic="http://schemas.openxmlformats.org/drawingml/2006/picture">
-                  <wp:extent cx="9144000" cy="5943600"/>
+                  <wp:extent cx="9144000" cy="5715000"/>
                   <wp:docPr id="20" name="Picture 20"/>
                   <wp:cNvGraphicFramePr>
                     <a:graphicFrameLocks noChangeAspect="1"/>
@@ -2297,7 +2297,7 @@
                           <pic:cNvPicPr/>
                         </pic:nvPicPr>
                         <pic:blipFill>
-                          <a:blip r:embed="rId26"/>
+                          <a:blip r:embed="rId28"/>
                           <a:stretch>
                             <a:fillRect/>
                           </a:stretch>
@@ -2305,7 +2305,7 @@
                         <pic:spPr>
                           <a:xfrm>
                             <a:off x="0" y="0"/>
-                            <a:ext cx="9144000" cy="5943600"/>
+                            <a:ext cx="9144000" cy="5715000"/>
                           </a:xfrm>
                           <a:prstGeom prst="rect"/>
                         </pic:spPr>
@@ -2415,7 +2415,7 @@
             <w:r>
               <w:drawing>
                 <wp:inline xmlns:a="http://schemas.openxmlformats.org/drawingml/2006/main" xmlns:pic="http://schemas.openxmlformats.org/drawingml/2006/picture">
-                  <wp:extent cx="9144000" cy="5943600"/>
+                  <wp:extent cx="9144000" cy="5715000"/>
                   <wp:docPr id="21" name="Picture 21"/>
                   <wp:cNvGraphicFramePr>
                     <a:graphicFrameLocks noChangeAspect="1"/>
@@ -2428,7 +2428,7 @@
                           <pic:cNvPicPr/>
                         </pic:nvPicPr>
                         <pic:blipFill>
-                          <a:blip r:embed="rId27"/>
+                          <a:blip r:embed="rId29"/>
                           <a:stretch>
                             <a:fillRect/>
                           </a:stretch>
@@ -2436,7 +2436,7 @@
                         <pic:spPr>
                           <a:xfrm>
                             <a:off x="0" y="0"/>
-                            <a:ext cx="9144000" cy="5943600"/>
+                            <a:ext cx="9144000" cy="5715000"/>
                           </a:xfrm>
                           <a:prstGeom prst="rect"/>
                         </pic:spPr>
@@ -2546,7 +2546,7 @@
             <w:r>
               <w:drawing>
                 <wp:inline xmlns:a="http://schemas.openxmlformats.org/drawingml/2006/main" xmlns:pic="http://schemas.openxmlformats.org/drawingml/2006/picture">
-                  <wp:extent cx="9144000" cy="5943600"/>
+                  <wp:extent cx="9144000" cy="5715000"/>
                   <wp:docPr id="22" name="Picture 22"/>
                   <wp:cNvGraphicFramePr>
                     <a:graphicFrameLocks noChangeAspect="1"/>
@@ -2559,7 +2559,7 @@
                           <pic:cNvPicPr/>
                         </pic:nvPicPr>
                         <pic:blipFill>
-                          <a:blip r:embed="rId28"/>
+                          <a:blip r:embed="rId30"/>
                           <a:stretch>
                             <a:fillRect/>
                           </a:stretch>
@@ -2567,7 +2567,7 @@
                         <pic:spPr>
                           <a:xfrm>
                             <a:off x="0" y="0"/>
-                            <a:ext cx="9144000" cy="5943600"/>
+                            <a:ext cx="9144000" cy="5715000"/>
                           </a:xfrm>
                           <a:prstGeom prst="rect"/>
                         </pic:spPr>
@@ -2677,7 +2677,7 @@
             <w:r>
               <w:drawing>
                 <wp:inline xmlns:a="http://schemas.openxmlformats.org/drawingml/2006/main" xmlns:pic="http://schemas.openxmlformats.org/drawingml/2006/picture">
-                  <wp:extent cx="9144000" cy="5943600"/>
+                  <wp:extent cx="9144000" cy="5715000"/>
                   <wp:docPr id="23" name="Picture 23"/>
                   <wp:cNvGraphicFramePr>
                     <a:graphicFrameLocks noChangeAspect="1"/>
@@ -2690,7 +2690,7 @@
                           <pic:cNvPicPr/>
                         </pic:nvPicPr>
                         <pic:blipFill>
-                          <a:blip r:embed="rId29"/>
+                          <a:blip r:embed="rId31"/>
                           <a:stretch>
                             <a:fillRect/>
                           </a:stretch>
@@ -2698,7 +2698,7 @@
                         <pic:spPr>
                           <a:xfrm>
                             <a:off x="0" y="0"/>
-                            <a:ext cx="9144000" cy="5943600"/>
+                            <a:ext cx="9144000" cy="5715000"/>
                           </a:xfrm>
                           <a:prstGeom prst="rect"/>
                         </pic:spPr>
@@ -2808,7 +2808,7 @@
             <w:r>
               <w:drawing>
                 <wp:inline xmlns:a="http://schemas.openxmlformats.org/drawingml/2006/main" xmlns:pic="http://schemas.openxmlformats.org/drawingml/2006/picture">
-                  <wp:extent cx="9144000" cy="5943600"/>
+                  <wp:extent cx="9144000" cy="5715000"/>
                   <wp:docPr id="24" name="Picture 24"/>
                   <wp:cNvGraphicFramePr>
                     <a:graphicFrameLocks noChangeAspect="1"/>
@@ -2821,7 +2821,7 @@
                           <pic:cNvPicPr/>
                         </pic:nvPicPr>
                         <pic:blipFill>
-                          <a:blip r:embed="rId30"/>
+                          <a:blip r:embed="rId32"/>
                           <a:stretch>
                             <a:fillRect/>
                           </a:stretch>
@@ -2829,7 +2829,7 @@
                         <pic:spPr>
                           <a:xfrm>
                             <a:off x="0" y="0"/>
-                            <a:ext cx="9144000" cy="5943600"/>
+                            <a:ext cx="9144000" cy="5715000"/>
                           </a:xfrm>
                           <a:prstGeom prst="rect"/>
                         </pic:spPr>
@@ -2939,7 +2939,7 @@
             <w:r>
               <w:drawing>
                 <wp:inline xmlns:a="http://schemas.openxmlformats.org/drawingml/2006/main" xmlns:pic="http://schemas.openxmlformats.org/drawingml/2006/picture">
-                  <wp:extent cx="9144000" cy="5943600"/>
+                  <wp:extent cx="9144000" cy="5715000"/>
                   <wp:docPr id="25" name="Picture 25"/>
                   <wp:cNvGraphicFramePr>
                     <a:graphicFrameLocks noChangeAspect="1"/>
@@ -2948,11 +2948,11 @@
                     <a:graphicData uri="http://schemas.openxmlformats.org/drawingml/2006/picture">
                       <pic:pic>
                         <pic:nvPicPr>
-                          <pic:cNvPr id="0" name="prototype-rcm.jpg"/>
+                          <pic:cNvPr id="0" name="prototype-persona-cfo.jpg"/>
                           <pic:cNvPicPr/>
                         </pic:nvPicPr>
                         <pic:blipFill>
-                          <a:blip r:embed="rId14"/>
+                          <a:blip r:embed="rId33"/>
                           <a:stretch>
                             <a:fillRect/>
                           </a:stretch>
@@ -2960,7 +2960,7 @@
                         <pic:spPr>
                           <a:xfrm>
                             <a:off x="0" y="0"/>
-                            <a:ext cx="9144000" cy="5943600"/>
+                            <a:ext cx="9144000" cy="5715000"/>
                           </a:xfrm>
                           <a:prstGeom prst="rect"/>
                         </pic:spPr>
@@ -3070,7 +3070,7 @@
             <w:r>
               <w:drawing>
                 <wp:inline xmlns:a="http://schemas.openxmlformats.org/drawingml/2006/main" xmlns:pic="http://schemas.openxmlformats.org/drawingml/2006/picture">
-                  <wp:extent cx="9144000" cy="5943600"/>
+                  <wp:extent cx="9144000" cy="5715000"/>
                   <wp:docPr id="26" name="Picture 26"/>
                   <wp:cNvGraphicFramePr>
                     <a:graphicFrameLocks noChangeAspect="1"/>
@@ -3079,11 +3079,11 @@
                     <a:graphicData uri="http://schemas.openxmlformats.org/drawingml/2006/picture">
                       <pic:pic>
                         <pic:nvPicPr>
-                          <pic:cNvPr id="0" name="prototype-him-services.jpg"/>
+                          <pic:cNvPr id="0" name="prototype-persona-him-manager.jpg"/>
                           <pic:cNvPicPr/>
                         </pic:nvPicPr>
                         <pic:blipFill>
-                          <a:blip r:embed="rId18"/>
+                          <a:blip r:embed="rId34"/>
                           <a:stretch>
                             <a:fillRect/>
                           </a:stretch>
@@ -3091,7 +3091,7 @@
                         <pic:spPr>
                           <a:xfrm>
                             <a:off x="0" y="0"/>
-                            <a:ext cx="9144000" cy="5943600"/>
+                            <a:ext cx="9144000" cy="5715000"/>
                           </a:xfrm>
                           <a:prstGeom prst="rect"/>
                         </pic:spPr>
@@ -3201,7 +3201,7 @@
             <w:r>
               <w:drawing>
                 <wp:inline xmlns:a="http://schemas.openxmlformats.org/drawingml/2006/main" xmlns:pic="http://schemas.openxmlformats.org/drawingml/2006/picture">
-                  <wp:extent cx="9144000" cy="5943600"/>
+                  <wp:extent cx="9144000" cy="5715000"/>
                   <wp:docPr id="27" name="Picture 27"/>
                   <wp:cNvGraphicFramePr>
                     <a:graphicFrameLocks noChangeAspect="1"/>
@@ -3214,7 +3214,7 @@
                           <pic:cNvPicPr/>
                         </pic:nvPicPr>
                         <pic:blipFill>
-                          <a:blip r:embed="rId31"/>
+                          <a:blip r:embed="rId35"/>
                           <a:stretch>
                             <a:fillRect/>
                           </a:stretch>
@@ -3222,7 +3222,7 @@
                         <pic:spPr>
                           <a:xfrm>
                             <a:off x="0" y="0"/>
-                            <a:ext cx="9144000" cy="5943600"/>
+                            <a:ext cx="9144000" cy="5715000"/>
                           </a:xfrm>
                           <a:prstGeom prst="rect"/>
                         </pic:spPr>
@@ -3332,7 +3332,7 @@
             <w:r>
               <w:drawing>
                 <wp:inline xmlns:a="http://schemas.openxmlformats.org/drawingml/2006/main" xmlns:pic="http://schemas.openxmlformats.org/drawingml/2006/picture">
-                  <wp:extent cx="9144000" cy="5943600"/>
+                  <wp:extent cx="9144000" cy="5715000"/>
                   <wp:docPr id="28" name="Picture 28"/>
                   <wp:cNvGraphicFramePr>
                     <a:graphicFrameLocks noChangeAspect="1"/>
@@ -3345,7 +3345,7 @@
                           <pic:cNvPicPr/>
                         </pic:nvPicPr>
                         <pic:blipFill>
-                          <a:blip r:embed="rId32"/>
+                          <a:blip r:embed="rId36"/>
                           <a:stretch>
                             <a:fillRect/>
                           </a:stretch>
@@ -3353,7 +3353,7 @@
                         <pic:spPr>
                           <a:xfrm>
                             <a:off x="0" y="0"/>
-                            <a:ext cx="9144000" cy="5943600"/>
+                            <a:ext cx="9144000" cy="5715000"/>
                           </a:xfrm>
                           <a:prstGeom prst="rect"/>
                         </pic:spPr>
@@ -3476,7 +3476,7 @@
                           <pic:cNvPicPr/>
                         </pic:nvPicPr>
                         <pic:blipFill>
-                          <a:blip r:embed="rId33"/>
+                          <a:blip r:embed="rId37"/>
                           <a:stretch>
                             <a:fillRect/>
                           </a:stretch>
@@ -3504,7 +3504,7 @@
       </w:r>
     </w:p>
     <w:sectPr>
-      <w:footerReference w:type="default" r:id="rId34"/>
+      <w:footerReference w:type="default" r:id="rId38"/>
       <w:pgSz w:w="15840" w:h="12240" w:orient="landscape"/>
       <w:pgMar w:top="648" w:right="792" w:bottom="648" w:left="792" w:header="720" w:footer="720" w:gutter="0"/>
       <w:cols w:space="720"/>

</xml_diff>